<commit_message>
Task 2.4: scoring, localStorage, and game state screens
</commit_message>
<xml_diff>
--- a/docs/AI_Reflection_Log.docx
+++ b/docs/AI_Reflection_Log.docx
@@ -15,8 +15,9 @@
           <w:sz w:val="32"/>
           <w:szCs w:val="32"/>
         </w:rPr>
-        <w:t>AI Reflection Log</w:t>
-      </w:r>
+        <w:t xml:space="preserve">AI Reflection Log </w:t>
+      </w:r>
+      <w:proofErr w:type="spellStart"/>
       <w:r>
         <w:rPr>
           <w:rFonts w:ascii="Calibri" w:eastAsia="Calibri" w:hAnsi="Calibri" w:cs="Calibri"/>
@@ -25,17 +26,6 @@
           <w:sz w:val="32"/>
           <w:szCs w:val="32"/>
         </w:rPr>
-        <w:t xml:space="preserve"> </w:t>
-      </w:r>
-      <w:proofErr w:type="spellStart"/>
-      <w:r>
-        <w:rPr>
-          <w:rFonts w:ascii="Calibri" w:eastAsia="Calibri" w:hAnsi="Calibri" w:cs="Calibri"/>
-          <w:b/>
-          <w:bCs/>
-          <w:sz w:val="32"/>
-          <w:szCs w:val="32"/>
-        </w:rPr>
         <w:t>EcoDash</w:t>
       </w:r>
       <w:proofErr w:type="spellEnd"/>
@@ -50,18 +40,8 @@
           <w:rFonts w:ascii="Calibri" w:eastAsia="Calibri" w:hAnsi="Calibri" w:cs="Calibri"/>
           <w:i/>
           <w:iCs/>
-          <w:color w:val="555555"/>
-        </w:rPr>
-        <w:t>WAS262</w:t>
-      </w:r>
-      <w:r>
-        <w:rPr>
-          <w:rFonts w:ascii="Calibri" w:eastAsia="Calibri" w:hAnsi="Calibri" w:cs="Calibri"/>
-          <w:i/>
-          <w:iCs/>
-          <w:color w:val="555555"/>
-        </w:rPr>
-        <w:t xml:space="preserve"> Web Animation Scripting | Ira van Zyl 25301804</w:t>
+        </w:rPr>
+        <w:t>WAS262 Web Animation Scripting | Ira van Zyl 25301804</w:t>
       </w:r>
     </w:p>
     <w:p>
@@ -87,25 +67,23 @@
         <w:rPr>
           <w:rFonts w:ascii="Calibri" w:eastAsia="Calibri" w:hAnsi="Calibri" w:cs="Calibri"/>
         </w:rPr>
-        <w:t>, as required by the WAS262 Assessment guidelines. Each entry records the prompt used, a summary of the AI's response, problems identified in that response, and how the code/ide</w:t>
-      </w:r>
-      <w:r>
-        <w:rPr>
-          <w:rFonts w:ascii="Calibri" w:eastAsia="Calibri" w:hAnsi="Calibri" w:cs="Calibri"/>
-        </w:rPr>
-        <w:t>a was reviewed, tested, and modified before inclusion in the final project.</w:t>
+        <w:t>, as required by the WAS262 Assessment guidelines. Each entry records the prompt used, a summary of the AI's response, problems identified in that response, and how the code/idea was reviewed, tested, and modified before inclusion in the final project.</w:t>
       </w:r>
     </w:p>
     <w:p>
       <w:pPr>
         <w:pStyle w:val="Heading3"/>
         <w:spacing w:before="240" w:after="120" w:line="360" w:lineRule="auto"/>
-      </w:pPr>
-      <w:r>
-        <w:rPr>
-          <w:rFonts w:ascii="Calibri" w:eastAsia="Calibri" w:hAnsi="Calibri" w:cs="Calibri"/>
-          <w:b/>
-          <w:bCs/>
+        <w:rPr>
+          <w:color w:val="auto"/>
+        </w:rPr>
+      </w:pPr>
+      <w:r>
+        <w:rPr>
+          <w:rFonts w:ascii="Calibri" w:eastAsia="Calibri" w:hAnsi="Calibri" w:cs="Calibri"/>
+          <w:b/>
+          <w:bCs/>
+          <w:color w:val="auto"/>
         </w:rPr>
         <w:t>Entry 1: Project Planning &amp; README Structure</w:t>
       </w:r>
@@ -159,15 +137,7 @@
           <w:b/>
           <w:bCs/>
         </w:rPr>
-        <w:t>AI response</w:t>
-      </w:r>
-      <w:r>
-        <w:rPr>
-          <w:rFonts w:ascii="Calibri" w:eastAsia="Calibri" w:hAnsi="Calibri" w:cs="Calibri"/>
-          <w:b/>
-          <w:bCs/>
-        </w:rPr>
-        <w:t xml:space="preserve"> summary:</w:t>
+        <w:t>AI response summary:</w:t>
       </w:r>
     </w:p>
     <w:p>
@@ -204,13 +174,7 @@
         <w:rPr>
           <w:rFonts w:ascii="Calibri" w:eastAsia="Calibri" w:hAnsi="Calibri" w:cs="Calibri"/>
         </w:rPr>
-        <w:t>The initial structure was generic and did not reference the specific African contex</w:t>
-      </w:r>
-      <w:r>
-        <w:rPr>
-          <w:rFonts w:ascii="Calibri" w:eastAsia="Calibri" w:hAnsi="Calibri" w:cs="Calibri"/>
-        </w:rPr>
-        <w:t>t requirement from the assignment brief.</w:t>
+        <w:t>The initial structure was generic and did not reference the specific African context requirement from the assignment brief.</w:t>
       </w:r>
     </w:p>
     <w:p>
@@ -242,22 +206,18 @@
       <w:pPr>
         <w:pStyle w:val="Heading3"/>
         <w:spacing w:before="240" w:after="120" w:line="360" w:lineRule="auto"/>
-      </w:pPr>
-      <w:r>
-        <w:rPr>
-          <w:rFonts w:ascii="Calibri" w:eastAsia="Calibri" w:hAnsi="Calibri" w:cs="Calibri"/>
-          <w:b/>
-          <w:bCs/>
-        </w:rPr>
-        <w:t>Entry 2: Vehicle Movement &amp; P</w:t>
-      </w:r>
-      <w:r>
-        <w:rPr>
-          <w:rFonts w:ascii="Calibri" w:eastAsia="Calibri" w:hAnsi="Calibri" w:cs="Calibri"/>
-          <w:b/>
-          <w:bCs/>
-        </w:rPr>
-        <w:t>hysics</w:t>
+        <w:rPr>
+          <w:color w:val="auto"/>
+        </w:rPr>
+      </w:pPr>
+      <w:r>
+        <w:rPr>
+          <w:rFonts w:ascii="Calibri" w:eastAsia="Calibri" w:hAnsi="Calibri" w:cs="Calibri"/>
+          <w:b/>
+          <w:bCs/>
+          <w:color w:val="auto"/>
+        </w:rPr>
+        <w:t>Entry 2: Vehicle Movement &amp; Physics</w:t>
       </w:r>
     </w:p>
     <w:p>
@@ -266,7 +226,7 @@
       </w:pPr>
       <w:r>
         <w:rPr>
-          <w:rFonts w:ascii="Calibri" w:eastAsia="Calibri" w:hAnsi="Calibri" w:cs="Calibri"/>
+          <w:rFonts w:eastAsia="Calibri"/>
           <w:b/>
           <w:bCs/>
         </w:rPr>
@@ -280,22 +240,48 @@
       </w:pPr>
       <w:r>
         <w:rPr>
-          <w:rFonts w:ascii="Calibri" w:eastAsia="Calibri" w:hAnsi="Calibri" w:cs="Calibri"/>
-        </w:rPr>
-        <w:t>[Fill in your actual prompt once you've had this conversation]</w:t>
+          <w:color w:val="0B0B0B"/>
+        </w:rPr>
+        <w:t>“Why does drag need to be applied before movement?”</w:t>
       </w:r>
     </w:p>
     <w:p>
       <w:pPr>
         <w:spacing w:before="120" w:after="40" w:line="360" w:lineRule="auto"/>
-      </w:pPr>
-      <w:r>
-        <w:rPr>
-          <w:rFonts w:ascii="Calibri" w:eastAsia="Calibri" w:hAnsi="Calibri" w:cs="Calibri"/>
+        <w:rPr>
+          <w:rFonts w:eastAsia="Calibri"/>
+          <w:b/>
+          <w:bCs/>
+        </w:rPr>
+      </w:pPr>
+      <w:r>
+        <w:rPr>
+          <w:rFonts w:eastAsia="Calibri"/>
           <w:b/>
           <w:bCs/>
         </w:rPr>
         <w:t>AI response summary:</w:t>
+      </w:r>
+    </w:p>
+    <w:p>
+      <w:pPr>
+        <w:spacing w:before="120" w:after="40" w:line="360" w:lineRule="auto"/>
+      </w:pPr>
+      <w:r>
+        <w:t>"Drag has to apply before the position update, because drag represents the resistance the vehicle experiences while moving through that frame — not something that happens after it's already moved."</w:t>
+      </w:r>
+    </w:p>
+    <w:p>
+      <w:pPr>
+        <w:spacing w:before="120" w:after="40" w:line="360" w:lineRule="auto"/>
+      </w:pPr>
+      <w:r>
+        <w:rPr>
+          <w:rFonts w:eastAsia="Calibri"/>
+          <w:b/>
+          <w:bCs/>
+        </w:rPr>
+        <w:t>Problems identified:</w:t>
       </w:r>
     </w:p>
     <w:p>
@@ -305,51 +291,83 @@
       </w:pPr>
       <w:r>
         <w:rPr>
-          <w:rFonts w:ascii="Calibri" w:eastAsia="Calibri" w:hAnsi="Calibri" w:cs="Calibri"/>
-        </w:rPr>
-        <w:t xml:space="preserve">[Summarise what the AI suggested — e.g. use of </w:t>
-      </w:r>
-      <w:proofErr w:type="spellStart"/>
-      <w:r>
-        <w:rPr>
-          <w:rFonts w:ascii="Calibri" w:eastAsia="Calibri" w:hAnsi="Calibri" w:cs="Calibri"/>
-        </w:rPr>
-        <w:t>Math.cos</w:t>
-      </w:r>
-      <w:proofErr w:type="spellEnd"/>
-      <w:r>
-        <w:rPr>
-          <w:rFonts w:ascii="Calibri" w:eastAsia="Calibri" w:hAnsi="Calibri" w:cs="Calibri"/>
-        </w:rPr>
-        <w:t>()/</w:t>
+          <w:rFonts w:eastAsia="Calibri"/>
+        </w:rPr>
+        <w:t xml:space="preserve">Initial code used </w:t>
+      </w:r>
+      <w:r>
+        <w:rPr>
+          <w:rFonts w:eastAsia="Calibri"/>
+        </w:rPr>
+        <w:t>the movement before drag.</w:t>
+      </w:r>
+    </w:p>
+    <w:p>
+      <w:pPr>
+        <w:spacing w:before="120" w:after="40" w:line="360" w:lineRule="auto"/>
+        <w:rPr>
+          <w:rFonts w:eastAsia="Calibri"/>
+          <w:b/>
+          <w:bCs/>
+        </w:rPr>
+      </w:pPr>
+      <w:r>
+        <w:rPr>
+          <w:rFonts w:eastAsia="Calibri"/>
+          <w:b/>
+          <w:bCs/>
+        </w:rPr>
+        <w:t>How it was modified:</w:t>
+      </w:r>
+    </w:p>
+    <w:p>
+      <w:pPr>
+        <w:spacing w:before="120" w:after="40" w:line="360" w:lineRule="auto"/>
+        <w:rPr>
+          <w:rFonts w:eastAsia="Calibri"/>
+        </w:rPr>
+      </w:pPr>
+      <w:r>
+        <w:rPr>
+          <w:rFonts w:eastAsia="Calibri"/>
+        </w:rPr>
+        <w:t xml:space="preserve">Confirmed by tracing through </w:t>
       </w:r>
       <w:proofErr w:type="spellStart"/>
       <w:proofErr w:type="gramStart"/>
       <w:r>
         <w:rPr>
-          <w:rFonts w:ascii="Calibri" w:eastAsia="Calibri" w:hAnsi="Calibri" w:cs="Calibri"/>
-        </w:rPr>
-        <w:t>Math.sin</w:t>
+          <w:rFonts w:eastAsia="Calibri"/>
+        </w:rPr>
+        <w:t>applyDragAndMove</w:t>
       </w:r>
       <w:proofErr w:type="spellEnd"/>
       <w:r>
         <w:rPr>
-          <w:rFonts w:ascii="Calibri" w:eastAsia="Calibri" w:hAnsi="Calibri" w:cs="Calibri"/>
+          <w:rFonts w:eastAsia="Calibri"/>
         </w:rPr>
         <w:t>(</w:t>
       </w:r>
       <w:proofErr w:type="gramEnd"/>
       <w:r>
         <w:rPr>
-          <w:rFonts w:ascii="Calibri" w:eastAsia="Calibri" w:hAnsi="Calibri" w:cs="Calibri"/>
-        </w:rPr>
-        <w:t>) for thrust direction, velocity/acceleration variables, drag as a multiplier applied</w:t>
-      </w:r>
-      <w:r>
-        <w:rPr>
-          <w:rFonts w:ascii="Calibri" w:eastAsia="Calibri" w:hAnsi="Calibri" w:cs="Calibri"/>
-        </w:rPr>
-        <w:t xml:space="preserve"> each frame]</w:t>
+          <w:rFonts w:eastAsia="Calibri"/>
+        </w:rPr>
+        <w:t xml:space="preserve">) manually: if the order were reversed, the vehicle would move at full, </w:t>
+      </w:r>
+      <w:proofErr w:type="spellStart"/>
+      <w:r>
+        <w:rPr>
+          <w:rFonts w:eastAsia="Calibri"/>
+        </w:rPr>
+        <w:t>undecayed</w:t>
+      </w:r>
+      <w:proofErr w:type="spellEnd"/>
+      <w:r>
+        <w:rPr>
+          <w:rFonts w:eastAsia="Calibri"/>
+        </w:rPr>
+        <w:t xml:space="preserve"> velocity for one frame before drag reduced it, creating an inconsistency between the frame's reported speed/battery drain and its actual on-screen movement.</w:t>
       </w:r>
     </w:p>
     <w:p>
@@ -358,11 +376,24 @@
       </w:pPr>
       <w:r>
         <w:rPr>
-          <w:rFonts w:ascii="Calibri" w:eastAsia="Calibri" w:hAnsi="Calibri" w:cs="Calibri"/>
-          <w:b/>
-          <w:bCs/>
-        </w:rPr>
-        <w:t>Problems identified:</w:t>
+          <w:rFonts w:eastAsia="Calibri"/>
+          <w:b/>
+          <w:bCs/>
+        </w:rPr>
+        <w:t>Entry 3: Obstacle &amp; Collision Detection</w:t>
+      </w:r>
+    </w:p>
+    <w:p>
+      <w:pPr>
+        <w:spacing w:before="120" w:after="40" w:line="360" w:lineRule="auto"/>
+      </w:pPr>
+      <w:r>
+        <w:rPr>
+          <w:rFonts w:ascii="Calibri" w:eastAsia="Calibri" w:hAnsi="Calibri" w:cs="Calibri"/>
+          <w:b/>
+          <w:bCs/>
+        </w:rPr>
+        <w:t>Prompt used:</w:t>
       </w:r>
     </w:p>
     <w:p>
@@ -374,7 +405,7 @@
         <w:rPr>
           <w:rFonts w:ascii="Calibri" w:eastAsia="Calibri" w:hAnsi="Calibri" w:cs="Calibri"/>
         </w:rPr>
-        <w:t>[e.g. “Initial code used generic variable names rather than descriptive names required by the rubric”]</w:t>
+        <w:t>[Fill in]</w:t>
       </w:r>
     </w:p>
     <w:p>
@@ -387,7 +418,8 @@
           <w:b/>
           <w:bCs/>
         </w:rPr>
-        <w:t>How it was modified:</w:t>
+        <w:lastRenderedPageBreak/>
+        <w:t>AI response summary:</w:t>
       </w:r>
     </w:p>
     <w:p>
@@ -399,27 +431,7 @@
         <w:rPr>
           <w:rFonts w:ascii="Calibri" w:eastAsia="Calibri" w:hAnsi="Calibri" w:cs="Calibri"/>
         </w:rPr>
-        <w:t>[e.g. “Renamed variables to match rubric requirement for descriptive naming; tuned drag coefficien</w:t>
-      </w:r>
-      <w:r>
-        <w:rPr>
-          <w:rFonts w:ascii="Calibri" w:eastAsia="Calibri" w:hAnsi="Calibri" w:cs="Calibri"/>
-        </w:rPr>
-        <w:t>t after testing”]</w:t>
-      </w:r>
-    </w:p>
-    <w:p>
-      <w:pPr>
-        <w:pStyle w:val="Heading3"/>
-        <w:spacing w:before="240" w:after="120" w:line="360" w:lineRule="auto"/>
-      </w:pPr>
-      <w:r>
-        <w:rPr>
-          <w:rFonts w:ascii="Calibri" w:eastAsia="Calibri" w:hAnsi="Calibri" w:cs="Calibri"/>
-          <w:b/>
-          <w:bCs/>
-        </w:rPr>
-        <w:t>Entry 3: Obstacle &amp; Collision Detection</w:t>
+        <w:t>[Fill in]</w:t>
       </w:r>
     </w:p>
     <w:p>
@@ -432,7 +444,7 @@
           <w:b/>
           <w:bCs/>
         </w:rPr>
-        <w:t>Prompt used:</w:t>
+        <w:t>Problems identified:</w:t>
       </w:r>
     </w:p>
     <w:p>
@@ -457,8 +469,7 @@
           <w:b/>
           <w:bCs/>
         </w:rPr>
-        <w:lastRenderedPageBreak/>
-        <w:t>AI response summary:</w:t>
+        <w:t>How it was modified:</w:t>
       </w:r>
     </w:p>
     <w:p>
@@ -475,15 +486,20 @@
     </w:p>
     <w:p>
       <w:pPr>
-        <w:spacing w:before="120" w:after="40" w:line="360" w:lineRule="auto"/>
-      </w:pPr>
-      <w:r>
-        <w:rPr>
-          <w:rFonts w:ascii="Calibri" w:eastAsia="Calibri" w:hAnsi="Calibri" w:cs="Calibri"/>
-          <w:b/>
-          <w:bCs/>
-        </w:rPr>
-        <w:t>Problems identified:</w:t>
+        <w:pStyle w:val="Heading2"/>
+        <w:spacing w:before="240" w:after="120" w:line="360" w:lineRule="auto"/>
+        <w:rPr>
+          <w:color w:val="auto"/>
+        </w:rPr>
+      </w:pPr>
+      <w:r>
+        <w:rPr>
+          <w:rFonts w:ascii="Calibri" w:eastAsia="Calibri" w:hAnsi="Calibri" w:cs="Calibri"/>
+          <w:b/>
+          <w:bCs/>
+          <w:color w:val="auto"/>
+        </w:rPr>
+        <w:t>Note on the Original (“AI-Blind”) Feature</w:t>
       </w:r>
     </w:p>
     <w:p>
@@ -495,20 +511,28 @@
         <w:rPr>
           <w:rFonts w:ascii="Calibri" w:eastAsia="Calibri" w:hAnsi="Calibri" w:cs="Calibri"/>
         </w:rPr>
-        <w:t>[Fill in]</w:t>
-      </w:r>
-    </w:p>
-    <w:p>
-      <w:pPr>
-        <w:spacing w:before="120" w:after="40" w:line="360" w:lineRule="auto"/>
-      </w:pPr>
-      <w:r>
-        <w:rPr>
-          <w:rFonts w:ascii="Calibri" w:eastAsia="Calibri" w:hAnsi="Calibri" w:cs="Calibri"/>
-          <w:b/>
-          <w:bCs/>
-        </w:rPr>
-        <w:t>How it was modified:</w:t>
+        <w:t>The feature described in Section 2.3 of the project report a day/night cycle reflecting the load-shedding schedule was developed entirely without Generative AI assistance, in line with the assignment's requirement for at least one independently built feature. No AI prompts were used for this component.</w:t>
+      </w:r>
+    </w:p>
+    <w:p>
+      <w:pPr>
+        <w:pStyle w:val="Heading2"/>
+        <w:spacing w:before="240" w:after="120" w:line="360" w:lineRule="auto"/>
+        <w:rPr>
+          <w:rFonts w:ascii="Calibri" w:eastAsia="Calibri" w:hAnsi="Calibri" w:cs="Calibri"/>
+          <w:b/>
+          <w:bCs/>
+          <w:color w:val="auto"/>
+        </w:rPr>
+      </w:pPr>
+      <w:r>
+        <w:rPr>
+          <w:rFonts w:ascii="Calibri" w:eastAsia="Calibri" w:hAnsi="Calibri" w:cs="Calibri"/>
+          <w:b/>
+          <w:bCs/>
+          <w:color w:val="auto"/>
+        </w:rPr>
+        <w:t>Screenshots of Prompts &amp; Responses</w:t>
       </w:r>
     </w:p>
     <w:p>
@@ -516,84 +540,147 @@
         <w:spacing w:after="160" w:line="360" w:lineRule="auto"/>
         <w:jc w:val="both"/>
       </w:pPr>
-      <w:r>
-        <w:rPr>
-          <w:rFonts w:ascii="Calibri" w:eastAsia="Calibri" w:hAnsi="Calibri" w:cs="Calibri"/>
-        </w:rPr>
-        <w:t>[Fill in]</w:t>
-      </w:r>
-    </w:p>
-    <w:p>
-      <w:pPr>
-        <w:pStyle w:val="Heading2"/>
-        <w:spacing w:before="240" w:after="120" w:line="360" w:lineRule="auto"/>
-      </w:pPr>
-      <w:r>
-        <w:rPr>
-          <w:rFonts w:ascii="Calibri" w:eastAsia="Calibri" w:hAnsi="Calibri" w:cs="Calibri"/>
-          <w:b/>
-          <w:bCs/>
-        </w:rPr>
-        <w:t>Note on the Original (“AI-Blind”) Feature</w:t>
-      </w:r>
-    </w:p>
-    <w:p>
-      <w:pPr>
-        <w:spacing w:after="160" w:line="360" w:lineRule="auto"/>
-        <w:jc w:val="both"/>
-      </w:pPr>
-      <w:r>
-        <w:rPr>
-          <w:rFonts w:ascii="Calibri" w:eastAsia="Calibri" w:hAnsi="Calibri" w:cs="Calibri"/>
-        </w:rPr>
-        <w:t xml:space="preserve">The feature described in Section 2.3 of the project report </w:t>
-      </w:r>
-      <w:r>
-        <w:rPr>
-          <w:rFonts w:ascii="Calibri" w:eastAsia="Calibri" w:hAnsi="Calibri" w:cs="Calibri"/>
-        </w:rPr>
-        <w:t xml:space="preserve">a day/night cycle reflecting the load-shedding </w:t>
-      </w:r>
       <w:bookmarkStart w:id="0" w:name="_GoBack"/>
       <w:bookmarkEnd w:id="0"/>
       <w:r>
         <w:rPr>
-          <w:rFonts w:ascii="Calibri" w:eastAsia="Calibri" w:hAnsi="Calibri" w:cs="Calibri"/>
-        </w:rPr>
-        <w:t>schedule was</w:t>
-      </w:r>
-      <w:r>
-        <w:rPr>
-          <w:rFonts w:ascii="Calibri" w:eastAsia="Calibri" w:hAnsi="Calibri" w:cs="Calibri"/>
-        </w:rPr>
-        <w:t xml:space="preserve"> developed entirely without Generative AI assistance, in line with the assignment's requirement for at least one independently built f</w:t>
-      </w:r>
-      <w:r>
-        <w:rPr>
-          <w:rFonts w:ascii="Calibri" w:eastAsia="Calibri" w:hAnsi="Calibri" w:cs="Calibri"/>
-        </w:rPr>
-        <w:t>eature. No AI prompts were used for this component.</w:t>
-      </w:r>
-    </w:p>
-    <w:p>
-      <w:pPr>
-        <w:pStyle w:val="Heading2"/>
-        <w:spacing w:before="240" w:after="120" w:line="360" w:lineRule="auto"/>
-      </w:pPr>
-      <w:r>
-        <w:rPr>
-          <w:rFonts w:ascii="Calibri" w:eastAsia="Calibri" w:hAnsi="Calibri" w:cs="Calibri"/>
-          <w:b/>
-          <w:bCs/>
-        </w:rPr>
-        <w:t>Screenshots of Prompts &amp; Responses</w:t>
-      </w:r>
-    </w:p>
-    <w:p>
-      <w:pPr>
-        <w:spacing w:after="160" w:line="360" w:lineRule="auto"/>
-        <w:jc w:val="both"/>
-      </w:pPr>
+          <w:noProof/>
+        </w:rPr>
+        <w:lastRenderedPageBreak/>
+        <w:drawing>
+          <wp:inline distT="0" distB="0" distL="0" distR="0">
+            <wp:extent cx="5853430" cy="2049733"/>
+            <wp:effectExtent l="0" t="0" r="0" b="8255"/>
+            <wp:docPr id="1" name="Picture 1"/>
+            <wp:cNvGraphicFramePr>
+              <a:graphicFrameLocks xmlns:a="http://schemas.openxmlformats.org/drawingml/2006/main" noChangeAspect="1"/>
+            </wp:cNvGraphicFramePr>
+            <a:graphic xmlns:a="http://schemas.openxmlformats.org/drawingml/2006/main">
+              <a:graphicData uri="http://schemas.openxmlformats.org/drawingml/2006/picture">
+                <pic:pic xmlns:pic="http://schemas.openxmlformats.org/drawingml/2006/picture">
+                  <pic:nvPicPr>
+                    <pic:cNvPr id="1" name="Screenshot 2026-09-21 130903.png"/>
+                    <pic:cNvPicPr/>
+                  </pic:nvPicPr>
+                  <pic:blipFill>
+                    <a:blip r:embed="rId5">
+                      <a:extLst>
+                        <a:ext uri="{28A0092B-C50C-407E-A947-70E740481C1C}">
+                          <a14:useLocalDpi xmlns:a14="http://schemas.microsoft.com/office/drawing/2010/main" val="0"/>
+                        </a:ext>
+                      </a:extLst>
+                    </a:blip>
+                    <a:stretch>
+                      <a:fillRect/>
+                    </a:stretch>
+                  </pic:blipFill>
+                  <pic:spPr>
+                    <a:xfrm>
+                      <a:off x="0" y="0"/>
+                      <a:ext cx="5889582" cy="2062393"/>
+                    </a:xfrm>
+                    <a:prstGeom prst="rect">
+                      <a:avLst/>
+                    </a:prstGeom>
+                  </pic:spPr>
+                </pic:pic>
+              </a:graphicData>
+            </a:graphic>
+          </wp:inline>
+        </w:drawing>
+      </w:r>
+      <w:r>
+        <w:rPr>
+          <w:noProof/>
+        </w:rPr>
+        <w:drawing>
+          <wp:inline distT="0" distB="0" distL="0" distR="0">
+            <wp:extent cx="5866130" cy="3231302"/>
+            <wp:effectExtent l="0" t="0" r="1270" b="7620"/>
+            <wp:docPr id="2" name="Picture 2"/>
+            <wp:cNvGraphicFramePr>
+              <a:graphicFrameLocks xmlns:a="http://schemas.openxmlformats.org/drawingml/2006/main" noChangeAspect="1"/>
+            </wp:cNvGraphicFramePr>
+            <a:graphic xmlns:a="http://schemas.openxmlformats.org/drawingml/2006/main">
+              <a:graphicData uri="http://schemas.openxmlformats.org/drawingml/2006/picture">
+                <pic:pic xmlns:pic="http://schemas.openxmlformats.org/drawingml/2006/picture">
+                  <pic:nvPicPr>
+                    <pic:cNvPr id="2" name="Screenshot 2026-09-21 131126.png"/>
+                    <pic:cNvPicPr/>
+                  </pic:nvPicPr>
+                  <pic:blipFill>
+                    <a:blip r:embed="rId6">
+                      <a:extLst>
+                        <a:ext uri="{28A0092B-C50C-407E-A947-70E740481C1C}">
+                          <a14:useLocalDpi xmlns:a14="http://schemas.microsoft.com/office/drawing/2010/main" val="0"/>
+                        </a:ext>
+                      </a:extLst>
+                    </a:blip>
+                    <a:stretch>
+                      <a:fillRect/>
+                    </a:stretch>
+                  </pic:blipFill>
+                  <pic:spPr>
+                    <a:xfrm>
+                      <a:off x="0" y="0"/>
+                      <a:ext cx="5874144" cy="3235717"/>
+                    </a:xfrm>
+                    <a:prstGeom prst="rect">
+                      <a:avLst/>
+                    </a:prstGeom>
+                  </pic:spPr>
+                </pic:pic>
+              </a:graphicData>
+            </a:graphic>
+          </wp:inline>
+        </w:drawing>
+      </w:r>
+      <w:r>
+        <w:rPr>
+          <w:noProof/>
+        </w:rPr>
+        <w:drawing>
+          <wp:inline distT="0" distB="0" distL="0" distR="0">
+            <wp:extent cx="5866130" cy="2990278"/>
+            <wp:effectExtent l="0" t="0" r="1270" b="635"/>
+            <wp:docPr id="3" name="Picture 3"/>
+            <wp:cNvGraphicFramePr>
+              <a:graphicFrameLocks xmlns:a="http://schemas.openxmlformats.org/drawingml/2006/main" noChangeAspect="1"/>
+            </wp:cNvGraphicFramePr>
+            <a:graphic xmlns:a="http://schemas.openxmlformats.org/drawingml/2006/main">
+              <a:graphicData uri="http://schemas.openxmlformats.org/drawingml/2006/picture">
+                <pic:pic xmlns:pic="http://schemas.openxmlformats.org/drawingml/2006/picture">
+                  <pic:nvPicPr>
+                    <pic:cNvPr id="3" name="Screenshot 2026-09-21 131142.png"/>
+                    <pic:cNvPicPr/>
+                  </pic:nvPicPr>
+                  <pic:blipFill>
+                    <a:blip r:embed="rId7">
+                      <a:extLst>
+                        <a:ext uri="{28A0092B-C50C-407E-A947-70E740481C1C}">
+                          <a14:useLocalDpi xmlns:a14="http://schemas.microsoft.com/office/drawing/2010/main" val="0"/>
+                        </a:ext>
+                      </a:extLst>
+                    </a:blip>
+                    <a:stretch>
+                      <a:fillRect/>
+                    </a:stretch>
+                  </pic:blipFill>
+                  <pic:spPr>
+                    <a:xfrm>
+                      <a:off x="0" y="0"/>
+                      <a:ext cx="5874497" cy="2994543"/>
+                    </a:xfrm>
+                    <a:prstGeom prst="rect">
+                      <a:avLst/>
+                    </a:prstGeom>
+                  </pic:spPr>
+                </pic:pic>
+              </a:graphicData>
+            </a:graphic>
+          </wp:inline>
+        </w:drawing>
+      </w:r>
     </w:p>
     <w:sectPr>
       <w:pgSz w:w="11906" w:h="16838"/>

</xml_diff>

<commit_message>
Updated AI Reflection Log and African Context Report with final content.
</commit_message>
<xml_diff>
--- a/docs/AI_Reflection_Log.docx
+++ b/docs/AI_Reflection_Log.docx
@@ -194,6 +194,9 @@
       <w:pPr>
         <w:spacing w:after="160" w:line="360" w:lineRule="auto"/>
         <w:jc w:val="both"/>
+        <w:rPr>
+          <w:rFonts w:ascii="Calibri" w:eastAsia="Calibri" w:hAnsi="Calibri" w:cs="Calibri"/>
+        </w:rPr>
       </w:pPr>
       <w:r>
         <w:rPr>
@@ -201,6 +204,12 @@
         </w:rPr>
         <w:t>Added an “African Challenge Addressed” section, linked it to the context report, and tailored the folder structure to match the actual files built for this project.</w:t>
       </w:r>
+    </w:p>
+    <w:p>
+      <w:pPr>
+        <w:spacing w:after="160" w:line="360" w:lineRule="auto"/>
+        <w:jc w:val="both"/>
+      </w:pPr>
     </w:p>
     <w:p>
       <w:pPr>
@@ -373,19 +382,39 @@
     <w:p>
       <w:pPr>
         <w:spacing w:before="120" w:after="40" w:line="360" w:lineRule="auto"/>
-      </w:pPr>
-      <w:r>
         <w:rPr>
           <w:rFonts w:eastAsia="Calibri"/>
-          <w:b/>
-          <w:bCs/>
-        </w:rPr>
+        </w:rPr>
+      </w:pPr>
+    </w:p>
+    <w:p>
+      <w:pPr>
+        <w:spacing w:before="120" w:after="40" w:line="360" w:lineRule="auto"/>
+        <w:rPr>
+          <w:sz w:val="22"/>
+          <w:szCs w:val="22"/>
+        </w:rPr>
+      </w:pPr>
+      <w:r>
+        <w:rPr>
+          <w:rFonts w:eastAsia="Calibri"/>
+          <w:b/>
+          <w:bCs/>
+          <w:sz w:val="22"/>
+          <w:szCs w:val="22"/>
+        </w:rPr>
+        <w:lastRenderedPageBreak/>
         <w:t>Entry 3: Obstacle &amp; Collision Detection</w:t>
       </w:r>
     </w:p>
     <w:p>
       <w:pPr>
         <w:spacing w:before="120" w:after="40" w:line="360" w:lineRule="auto"/>
+        <w:rPr>
+          <w:rFonts w:ascii="Calibri" w:eastAsia="Calibri" w:hAnsi="Calibri" w:cs="Calibri"/>
+          <w:b/>
+          <w:bCs/>
+        </w:rPr>
       </w:pPr>
       <w:r>
         <w:rPr>
@@ -394,6 +423,60 @@
           <w:bCs/>
         </w:rPr>
         <w:t>Prompt used:</w:t>
+      </w:r>
+    </w:p>
+    <w:p>
+      <w:pPr>
+        <w:spacing w:before="120" w:after="40" w:line="360" w:lineRule="auto"/>
+      </w:pPr>
+      <w:r>
+        <w:rPr>
+          <w:color w:val="0B0B0B"/>
+        </w:rPr>
+        <w:t>Why does my code use two different collision detection methods (</w:t>
+      </w:r>
+      <w:proofErr w:type="spellStart"/>
+      <w:r>
+        <w:rPr>
+          <w:rStyle w:val="HTMLCode"/>
+          <w:rFonts w:ascii="Times New Roman" w:hAnsi="Times New Roman" w:cs="Times New Roman"/>
+        </w:rPr>
+        <w:t>circlesCollide</w:t>
+      </w:r>
+      <w:proofErr w:type="spellEnd"/>
+      <w:r>
+        <w:t xml:space="preserve"> and </w:t>
+      </w:r>
+      <w:proofErr w:type="spellStart"/>
+      <w:r>
+        <w:rPr>
+          <w:rStyle w:val="HTMLCode"/>
+          <w:rFonts w:ascii="Times New Roman" w:hAnsi="Times New Roman" w:cs="Times New Roman"/>
+        </w:rPr>
+        <w:t>circleRectCollide</w:t>
+      </w:r>
+      <w:proofErr w:type="spellEnd"/>
+      <w:r>
+        <w:t xml:space="preserve">) instead </w:t>
+      </w:r>
+      <w:r>
+        <w:rPr>
+          <w:color w:val="0B0B0B"/>
+        </w:rPr>
+        <w:t>of just one method for every obstacle?</w:t>
+      </w:r>
+    </w:p>
+    <w:p>
+      <w:pPr>
+        <w:spacing w:before="120" w:after="40" w:line="360" w:lineRule="auto"/>
+      </w:pPr>
+      <w:r>
+        <w:rPr>
+          <w:rFonts w:eastAsia="Calibri"/>
+          <w:b/>
+          <w:bCs/>
+        </w:rPr>
+        <w:t>AI response summary:</w:t>
       </w:r>
     </w:p>
     <w:p>
@@ -402,24 +485,79 @@
         <w:jc w:val="both"/>
       </w:pPr>
       <w:r>
-        <w:rPr>
-          <w:rFonts w:ascii="Calibri" w:eastAsia="Calibri" w:hAnsi="Calibri" w:cs="Calibri"/>
-        </w:rPr>
-        <w:t>[Fill in]</w:t>
+        <w:t>U</w:t>
+      </w:r>
+      <w:r>
+        <w:t>sing both deliberately, matched to each obstacle's actual shape, is stronger evidence of understanding than defaulting to whichever one technically works everywhere.</w:t>
       </w:r>
     </w:p>
     <w:p>
       <w:pPr>
         <w:spacing w:before="120" w:after="40" w:line="360" w:lineRule="auto"/>
-      </w:pPr>
-      <w:r>
-        <w:rPr>
-          <w:rFonts w:ascii="Calibri" w:eastAsia="Calibri" w:hAnsi="Calibri" w:cs="Calibri"/>
-          <w:b/>
-          <w:bCs/>
-        </w:rPr>
-        <w:lastRenderedPageBreak/>
-        <w:t>AI response summary:</w:t>
+        <w:rPr>
+          <w:rFonts w:ascii="Calibri" w:eastAsia="Calibri" w:hAnsi="Calibri" w:cs="Calibri"/>
+          <w:b/>
+          <w:bCs/>
+        </w:rPr>
+      </w:pPr>
+      <w:r>
+        <w:rPr>
+          <w:rFonts w:ascii="Calibri" w:eastAsia="Calibri" w:hAnsi="Calibri" w:cs="Calibri"/>
+          <w:b/>
+          <w:bCs/>
+        </w:rPr>
+        <w:t>I</w:t>
+      </w:r>
+      <w:r>
+        <w:rPr>
+          <w:rFonts w:ascii="Calibri" w:eastAsia="Calibri" w:hAnsi="Calibri" w:cs="Calibri"/>
+          <w:b/>
+          <w:bCs/>
+        </w:rPr>
+        <w:t>dentified:</w:t>
+      </w:r>
+    </w:p>
+    <w:p>
+      <w:pPr>
+        <w:spacing w:before="120" w:after="40" w:line="360" w:lineRule="auto"/>
+      </w:pPr>
+      <w:r>
+        <w:t>I match the collision method t</w:t>
+      </w:r>
+      <w:r>
+        <w:t xml:space="preserve">o the obstacle's actual shape </w:t>
+      </w:r>
+      <w:r>
+        <w:t>circular distance for circular obstacles, and the closest-point rectang</w:t>
+      </w:r>
+      <w:r>
+        <w:t>le method for rectangular ones,</w:t>
+      </w:r>
+      <w:r>
+        <w:t xml:space="preserve"> because forcing a rectangle into a circular collision check would make the hitbox not match what's visually on screen.</w:t>
+      </w:r>
+    </w:p>
+    <w:p>
+      <w:pPr>
+        <w:spacing w:before="120" w:after="40" w:line="360" w:lineRule="auto"/>
+      </w:pPr>
+    </w:p>
+    <w:p>
+      <w:pPr>
+        <w:pStyle w:val="Heading2"/>
+        <w:spacing w:before="240" w:after="120" w:line="360" w:lineRule="auto"/>
+        <w:rPr>
+          <w:color w:val="auto"/>
+        </w:rPr>
+      </w:pPr>
+      <w:r>
+        <w:rPr>
+          <w:rFonts w:ascii="Calibri" w:eastAsia="Calibri" w:hAnsi="Calibri" w:cs="Calibri"/>
+          <w:b/>
+          <w:bCs/>
+          <w:color w:val="auto"/>
+        </w:rPr>
+        <w:t>Note on the Original (“AI-Blind”) Feature</w:t>
       </w:r>
     </w:p>
     <w:p>
@@ -431,20 +569,28 @@
         <w:rPr>
           <w:rFonts w:ascii="Calibri" w:eastAsia="Calibri" w:hAnsi="Calibri" w:cs="Calibri"/>
         </w:rPr>
-        <w:t>[Fill in]</w:t>
-      </w:r>
-    </w:p>
-    <w:p>
-      <w:pPr>
-        <w:spacing w:before="120" w:after="40" w:line="360" w:lineRule="auto"/>
-      </w:pPr>
-      <w:r>
-        <w:rPr>
-          <w:rFonts w:ascii="Calibri" w:eastAsia="Calibri" w:hAnsi="Calibri" w:cs="Calibri"/>
-          <w:b/>
-          <w:bCs/>
-        </w:rPr>
-        <w:t>Problems identified:</w:t>
+        <w:t>The feature described in Section 2.3 of the project report a day/night cycle reflecting the load-shedding schedule was developed entirely without Generative AI assistance, in line with the assignment's requirement for at least one independently built feature. No AI prompts were used for this component.</w:t>
+      </w:r>
+    </w:p>
+    <w:p>
+      <w:pPr>
+        <w:pStyle w:val="Heading2"/>
+        <w:spacing w:before="240" w:after="120" w:line="360" w:lineRule="auto"/>
+        <w:rPr>
+          <w:rFonts w:ascii="Calibri" w:eastAsia="Calibri" w:hAnsi="Calibri" w:cs="Calibri"/>
+          <w:b/>
+          <w:bCs/>
+          <w:color w:val="auto"/>
+        </w:rPr>
+      </w:pPr>
+      <w:r>
+        <w:rPr>
+          <w:rFonts w:ascii="Calibri" w:eastAsia="Calibri" w:hAnsi="Calibri" w:cs="Calibri"/>
+          <w:b/>
+          <w:bCs/>
+          <w:color w:val="auto"/>
+        </w:rPr>
+        <w:t>Screenshots of Prompts &amp; Responses</w:t>
       </w:r>
     </w:p>
     <w:p>
@@ -452,96 +598,6 @@
         <w:spacing w:after="160" w:line="360" w:lineRule="auto"/>
         <w:jc w:val="both"/>
       </w:pPr>
-      <w:r>
-        <w:rPr>
-          <w:rFonts w:ascii="Calibri" w:eastAsia="Calibri" w:hAnsi="Calibri" w:cs="Calibri"/>
-        </w:rPr>
-        <w:t>[Fill in]</w:t>
-      </w:r>
-    </w:p>
-    <w:p>
-      <w:pPr>
-        <w:spacing w:before="120" w:after="40" w:line="360" w:lineRule="auto"/>
-      </w:pPr>
-      <w:r>
-        <w:rPr>
-          <w:rFonts w:ascii="Calibri" w:eastAsia="Calibri" w:hAnsi="Calibri" w:cs="Calibri"/>
-          <w:b/>
-          <w:bCs/>
-        </w:rPr>
-        <w:t>How it was modified:</w:t>
-      </w:r>
-    </w:p>
-    <w:p>
-      <w:pPr>
-        <w:spacing w:after="160" w:line="360" w:lineRule="auto"/>
-        <w:jc w:val="both"/>
-      </w:pPr>
-      <w:r>
-        <w:rPr>
-          <w:rFonts w:ascii="Calibri" w:eastAsia="Calibri" w:hAnsi="Calibri" w:cs="Calibri"/>
-        </w:rPr>
-        <w:t>[Fill in]</w:t>
-      </w:r>
-    </w:p>
-    <w:p>
-      <w:pPr>
-        <w:pStyle w:val="Heading2"/>
-        <w:spacing w:before="240" w:after="120" w:line="360" w:lineRule="auto"/>
-        <w:rPr>
-          <w:color w:val="auto"/>
-        </w:rPr>
-      </w:pPr>
-      <w:r>
-        <w:rPr>
-          <w:rFonts w:ascii="Calibri" w:eastAsia="Calibri" w:hAnsi="Calibri" w:cs="Calibri"/>
-          <w:b/>
-          <w:bCs/>
-          <w:color w:val="auto"/>
-        </w:rPr>
-        <w:t>Note on the Original (“AI-Blind”) Feature</w:t>
-      </w:r>
-    </w:p>
-    <w:p>
-      <w:pPr>
-        <w:spacing w:after="160" w:line="360" w:lineRule="auto"/>
-        <w:jc w:val="both"/>
-      </w:pPr>
-      <w:r>
-        <w:rPr>
-          <w:rFonts w:ascii="Calibri" w:eastAsia="Calibri" w:hAnsi="Calibri" w:cs="Calibri"/>
-        </w:rPr>
-        <w:t>The feature described in Section 2.3 of the project report a day/night cycle reflecting the load-shedding schedule was developed entirely without Generative AI assistance, in line with the assignment's requirement for at least one independently built feature. No AI prompts were used for this component.</w:t>
-      </w:r>
-    </w:p>
-    <w:p>
-      <w:pPr>
-        <w:pStyle w:val="Heading2"/>
-        <w:spacing w:before="240" w:after="120" w:line="360" w:lineRule="auto"/>
-        <w:rPr>
-          <w:rFonts w:ascii="Calibri" w:eastAsia="Calibri" w:hAnsi="Calibri" w:cs="Calibri"/>
-          <w:b/>
-          <w:bCs/>
-          <w:color w:val="auto"/>
-        </w:rPr>
-      </w:pPr>
-      <w:r>
-        <w:rPr>
-          <w:rFonts w:ascii="Calibri" w:eastAsia="Calibri" w:hAnsi="Calibri" w:cs="Calibri"/>
-          <w:b/>
-          <w:bCs/>
-          <w:color w:val="auto"/>
-        </w:rPr>
-        <w:t>Screenshots of Prompts &amp; Responses</w:t>
-      </w:r>
-    </w:p>
-    <w:p>
-      <w:pPr>
-        <w:spacing w:after="160" w:line="360" w:lineRule="auto"/>
-        <w:jc w:val="both"/>
-      </w:pPr>
-      <w:bookmarkStart w:id="0" w:name="_GoBack"/>
-      <w:bookmarkEnd w:id="0"/>
       <w:r>
         <w:rPr>
           <w:noProof/>
@@ -670,6 +726,223 @@
                     <a:xfrm>
                       <a:off x="0" y="0"/>
                       <a:ext cx="5874497" cy="2994543"/>
+                    </a:xfrm>
+                    <a:prstGeom prst="rect">
+                      <a:avLst/>
+                    </a:prstGeom>
+                  </pic:spPr>
+                </pic:pic>
+              </a:graphicData>
+            </a:graphic>
+          </wp:inline>
+        </w:drawing>
+      </w:r>
+    </w:p>
+    <w:p>
+      <w:pPr>
+        <w:spacing w:after="160" w:line="360" w:lineRule="auto"/>
+        <w:jc w:val="both"/>
+      </w:pPr>
+    </w:p>
+    <w:p>
+      <w:pPr>
+        <w:spacing w:after="160" w:line="360" w:lineRule="auto"/>
+        <w:jc w:val="both"/>
+      </w:pPr>
+      <w:r>
+        <w:rPr>
+          <w:noProof/>
+        </w:rPr>
+        <w:lastRenderedPageBreak/>
+        <w:drawing>
+          <wp:inline distT="0" distB="0" distL="0" distR="0">
+            <wp:extent cx="6120130" cy="2453640"/>
+            <wp:effectExtent l="0" t="0" r="0" b="3810"/>
+            <wp:docPr id="5" name="Picture 5"/>
+            <wp:cNvGraphicFramePr>
+              <a:graphicFrameLocks xmlns:a="http://schemas.openxmlformats.org/drawingml/2006/main" noChangeAspect="1"/>
+            </wp:cNvGraphicFramePr>
+            <a:graphic xmlns:a="http://schemas.openxmlformats.org/drawingml/2006/main">
+              <a:graphicData uri="http://schemas.openxmlformats.org/drawingml/2006/picture">
+                <pic:pic xmlns:pic="http://schemas.openxmlformats.org/drawingml/2006/picture">
+                  <pic:nvPicPr>
+                    <pic:cNvPr id="5" name="Screenshot 2026-09-23 104659.png"/>
+                    <pic:cNvPicPr/>
+                  </pic:nvPicPr>
+                  <pic:blipFill>
+                    <a:blip r:embed="rId8">
+                      <a:extLst>
+                        <a:ext uri="{28A0092B-C50C-407E-A947-70E740481C1C}">
+                          <a14:useLocalDpi xmlns:a14="http://schemas.microsoft.com/office/drawing/2010/main" val="0"/>
+                        </a:ext>
+                      </a:extLst>
+                    </a:blip>
+                    <a:stretch>
+                      <a:fillRect/>
+                    </a:stretch>
+                  </pic:blipFill>
+                  <pic:spPr>
+                    <a:xfrm>
+                      <a:off x="0" y="0"/>
+                      <a:ext cx="6120130" cy="2453640"/>
+                    </a:xfrm>
+                    <a:prstGeom prst="rect">
+                      <a:avLst/>
+                    </a:prstGeom>
+                  </pic:spPr>
+                </pic:pic>
+              </a:graphicData>
+            </a:graphic>
+          </wp:inline>
+        </w:drawing>
+      </w:r>
+      <w:r>
+        <w:rPr>
+          <w:noProof/>
+        </w:rPr>
+        <w:drawing>
+          <wp:inline distT="0" distB="0" distL="0" distR="0">
+            <wp:extent cx="6120130" cy="2649855"/>
+            <wp:effectExtent l="0" t="0" r="0" b="0"/>
+            <wp:docPr id="6" name="Picture 6"/>
+            <wp:cNvGraphicFramePr>
+              <a:graphicFrameLocks xmlns:a="http://schemas.openxmlformats.org/drawingml/2006/main" noChangeAspect="1"/>
+            </wp:cNvGraphicFramePr>
+            <a:graphic xmlns:a="http://schemas.openxmlformats.org/drawingml/2006/main">
+              <a:graphicData uri="http://schemas.openxmlformats.org/drawingml/2006/picture">
+                <pic:pic xmlns:pic="http://schemas.openxmlformats.org/drawingml/2006/picture">
+                  <pic:nvPicPr>
+                    <pic:cNvPr id="6" name="Screenshot 2026-09-23 104715.png"/>
+                    <pic:cNvPicPr/>
+                  </pic:nvPicPr>
+                  <pic:blipFill>
+                    <a:blip r:embed="rId9">
+                      <a:extLst>
+                        <a:ext uri="{28A0092B-C50C-407E-A947-70E740481C1C}">
+                          <a14:useLocalDpi xmlns:a14="http://schemas.microsoft.com/office/drawing/2010/main" val="0"/>
+                        </a:ext>
+                      </a:extLst>
+                    </a:blip>
+                    <a:stretch>
+                      <a:fillRect/>
+                    </a:stretch>
+                  </pic:blipFill>
+                  <pic:spPr>
+                    <a:xfrm>
+                      <a:off x="0" y="0"/>
+                      <a:ext cx="6120130" cy="2649855"/>
+                    </a:xfrm>
+                    <a:prstGeom prst="rect">
+                      <a:avLst/>
+                    </a:prstGeom>
+                  </pic:spPr>
+                </pic:pic>
+              </a:graphicData>
+            </a:graphic>
+          </wp:inline>
+        </w:drawing>
+      </w:r>
+      <w:r>
+        <w:rPr>
+          <w:noProof/>
+        </w:rPr>
+        <w:drawing>
+          <wp:inline distT="0" distB="0" distL="0" distR="0">
+            <wp:extent cx="6120130" cy="1353185"/>
+            <wp:effectExtent l="0" t="0" r="0" b="0"/>
+            <wp:docPr id="7" name="Picture 7"/>
+            <wp:cNvGraphicFramePr>
+              <a:graphicFrameLocks xmlns:a="http://schemas.openxmlformats.org/drawingml/2006/main" noChangeAspect="1"/>
+            </wp:cNvGraphicFramePr>
+            <a:graphic xmlns:a="http://schemas.openxmlformats.org/drawingml/2006/main">
+              <a:graphicData uri="http://schemas.openxmlformats.org/drawingml/2006/picture">
+                <pic:pic xmlns:pic="http://schemas.openxmlformats.org/drawingml/2006/picture">
+                  <pic:nvPicPr>
+                    <pic:cNvPr id="7" name="Screenshot 2026-09-23 104735.png"/>
+                    <pic:cNvPicPr/>
+                  </pic:nvPicPr>
+                  <pic:blipFill>
+                    <a:blip r:embed="rId10">
+                      <a:extLst>
+                        <a:ext uri="{28A0092B-C50C-407E-A947-70E740481C1C}">
+                          <a14:useLocalDpi xmlns:a14="http://schemas.microsoft.com/office/drawing/2010/main" val="0"/>
+                        </a:ext>
+                      </a:extLst>
+                    </a:blip>
+                    <a:stretch>
+                      <a:fillRect/>
+                    </a:stretch>
+                  </pic:blipFill>
+                  <pic:spPr>
+                    <a:xfrm>
+                      <a:off x="0" y="0"/>
+                      <a:ext cx="6120130" cy="1353185"/>
+                    </a:xfrm>
+                    <a:prstGeom prst="rect">
+                      <a:avLst/>
+                    </a:prstGeom>
+                  </pic:spPr>
+                </pic:pic>
+              </a:graphicData>
+            </a:graphic>
+          </wp:inline>
+        </w:drawing>
+      </w:r>
+    </w:p>
+    <w:p>
+      <w:pPr>
+        <w:pStyle w:val="NormalWeb"/>
+      </w:pPr>
+      <w:bookmarkStart w:id="0" w:name="_GoBack"/>
+      <w:bookmarkEnd w:id="0"/>
+    </w:p>
+    <w:p>
+      <w:pPr>
+        <w:spacing w:after="160" w:line="360" w:lineRule="auto"/>
+        <w:jc w:val="both"/>
+      </w:pPr>
+    </w:p>
+    <w:p>
+      <w:pPr>
+        <w:spacing w:after="160" w:line="360" w:lineRule="auto"/>
+        <w:jc w:val="both"/>
+      </w:pPr>
+      <w:r>
+        <w:rPr>
+          <w:noProof/>
+        </w:rPr>
+        <w:lastRenderedPageBreak/>
+        <w:drawing>
+          <wp:inline distT="0" distB="0" distL="0" distR="0" wp14:anchorId="0A7F9C0E" wp14:editId="5C926C1F">
+            <wp:extent cx="6120130" cy="3065145"/>
+            <wp:effectExtent l="0" t="0" r="0" b="1905"/>
+            <wp:docPr id="4" name="Picture 4"/>
+            <wp:cNvGraphicFramePr>
+              <a:graphicFrameLocks xmlns:a="http://schemas.openxmlformats.org/drawingml/2006/main" noChangeAspect="1"/>
+            </wp:cNvGraphicFramePr>
+            <a:graphic xmlns:a="http://schemas.openxmlformats.org/drawingml/2006/main">
+              <a:graphicData uri="http://schemas.openxmlformats.org/drawingml/2006/picture">
+                <pic:pic xmlns:pic="http://schemas.openxmlformats.org/drawingml/2006/picture">
+                  <pic:nvPicPr>
+                    <pic:cNvPr id="4" name="Screenshot 2026-09-23 103725.png"/>
+                    <pic:cNvPicPr/>
+                  </pic:nvPicPr>
+                  <pic:blipFill>
+                    <a:blip r:embed="rId11">
+                      <a:extLst>
+                        <a:ext uri="{28A0092B-C50C-407E-A947-70E740481C1C}">
+                          <a14:useLocalDpi xmlns:a14="http://schemas.microsoft.com/office/drawing/2010/main" val="0"/>
+                        </a:ext>
+                      </a:extLst>
+                    </a:blip>
+                    <a:stretch>
+                      <a:fillRect/>
+                    </a:stretch>
+                  </pic:blipFill>
+                  <pic:spPr>
+                    <a:xfrm>
+                      <a:off x="0" y="0"/>
+                      <a:ext cx="6120130" cy="3065145"/>
                     </a:xfrm>
                     <a:prstGeom prst="rect">
                       <a:avLst/>
@@ -1355,6 +1628,34 @@
       <w:szCs w:val="20"/>
     </w:rPr>
   </w:style>
+  <w:style w:type="character" w:styleId="HTMLCode">
+    <w:name w:val="HTML Code"/>
+    <w:basedOn w:val="DefaultParagraphFont"/>
+    <w:uiPriority w:val="99"/>
+    <w:semiHidden/>
+    <w:unhideWhenUsed/>
+    <w:rsid w:val="00F1396B"/>
+    <w:rPr>
+      <w:rFonts w:ascii="Courier New" w:eastAsia="Times New Roman" w:hAnsi="Courier New" w:cs="Courier New"/>
+      <w:sz w:val="20"/>
+      <w:szCs w:val="20"/>
+    </w:rPr>
+  </w:style>
+  <w:style w:type="paragraph" w:styleId="NormalWeb">
+    <w:name w:val="Normal (Web)"/>
+    <w:basedOn w:val="Normal"/>
+    <w:uiPriority w:val="99"/>
+    <w:semiHidden/>
+    <w:unhideWhenUsed/>
+    <w:rsid w:val="00F1396B"/>
+    <w:pPr>
+      <w:spacing w:before="100" w:beforeAutospacing="1" w:after="100" w:afterAutospacing="1"/>
+    </w:pPr>
+    <w:rPr>
+      <w:sz w:val="24"/>
+      <w:szCs w:val="24"/>
+    </w:rPr>
+  </w:style>
 </w:styles>
 </file>
 

</xml_diff>

<commit_message>
Fixed pothole collision re-triggering every frame instead of once per contact
</commit_message>
<xml_diff>
--- a/docs/AI_Reflection_Log.docx
+++ b/docs/AI_Reflection_Log.docx
@@ -485,10 +485,7 @@
         <w:jc w:val="both"/>
       </w:pPr>
       <w:r>
-        <w:t>U</w:t>
-      </w:r>
-      <w:r>
-        <w:t>sing both deliberately, matched to each obstacle's actual shape, is stronger evidence of understanding than defaulting to whichever one technically works everywhere.</w:t>
+        <w:t>Using both deliberately, matched to each obstacle's actual shape, is stronger evidence of understanding than defaulting to whichever one technically works everywhere.</w:t>
       </w:r>
     </w:p>
     <w:p>
@@ -522,19 +519,333 @@
         <w:spacing w:before="120" w:after="40" w:line="360" w:lineRule="auto"/>
       </w:pPr>
       <w:r>
-        <w:t>I match the collision method t</w:t>
-      </w:r>
-      <w:r>
-        <w:t xml:space="preserve">o the obstacle's actual shape </w:t>
-      </w:r>
-      <w:r>
-        <w:t>circular distance for circular obstacles, and the closest-point rectang</w:t>
-      </w:r>
-      <w:r>
-        <w:t>le method for rectangular ones,</w:t>
-      </w:r>
-      <w:r>
-        <w:t xml:space="preserve"> because forcing a rectangle into a circular collision check would make the hitbox not match what's visually on screen.</w:t>
+        <w:t>I match the collision method to the obstacle's actual shape circular distance for circular obstacles, and the closest-point rectangle method for rectangular ones, because forcing a rectangle into a circular collision check would make the hitbox not match what's visually on screen.</w:t>
+      </w:r>
+    </w:p>
+    <w:p>
+      <w:pPr>
+        <w:pStyle w:val="Heading3"/>
+        <w:spacing w:before="240" w:after="120" w:line="360" w:lineRule="auto"/>
+        <w:rPr>
+          <w:color w:val="auto"/>
+        </w:rPr>
+      </w:pPr>
+      <w:r>
+        <w:rPr>
+          <w:rFonts w:ascii="Calibri" w:eastAsia="Calibri" w:hAnsi="Calibri" w:cs="Calibri"/>
+          <w:b/>
+          <w:bCs/>
+          <w:color w:val="auto"/>
+        </w:rPr>
+        <w:t>Entry 4</w:t>
+      </w:r>
+      <w:r>
+        <w:rPr>
+          <w:rFonts w:ascii="Calibri" w:eastAsia="Calibri" w:hAnsi="Calibri" w:cs="Calibri"/>
+          <w:b/>
+          <w:bCs/>
+          <w:color w:val="auto"/>
+        </w:rPr>
+        <w:t xml:space="preserve">: Pothole Collision </w:t>
+      </w:r>
+    </w:p>
+    <w:p>
+      <w:pPr>
+        <w:spacing w:before="120" w:after="40" w:line="360" w:lineRule="auto"/>
+      </w:pPr>
+      <w:r>
+        <w:rPr>
+          <w:rFonts w:eastAsia="Calibri"/>
+          <w:b/>
+          <w:bCs/>
+        </w:rPr>
+        <w:t>Prompt used:</w:t>
+      </w:r>
+    </w:p>
+    <w:p>
+      <w:pPr>
+        <w:spacing w:after="160" w:line="360" w:lineRule="auto"/>
+        <w:jc w:val="both"/>
+      </w:pPr>
+      <w:r>
+        <w:rPr>
+          <w:color w:val="0B0B0B"/>
+        </w:rPr>
+        <w:t>“</w:t>
+      </w:r>
+      <w:r>
+        <w:rPr>
+          <w:color w:val="0B0B0B"/>
+        </w:rPr>
+        <w:t>O</w:t>
+      </w:r>
+      <w:r>
+        <w:rPr>
+          <w:color w:val="0B0B0B"/>
+        </w:rPr>
+        <w:t xml:space="preserve">nce my 'car' hits the top pothole the battery goes to 0 and it says battery </w:t>
+      </w:r>
+      <w:proofErr w:type="spellStart"/>
+      <w:r>
+        <w:rPr>
+          <w:color w:val="0B0B0B"/>
+        </w:rPr>
+        <w:t>depleated</w:t>
+      </w:r>
+      <w:proofErr w:type="spellEnd"/>
+      <w:r>
+        <w:rPr>
+          <w:color w:val="0B0B0B"/>
+        </w:rPr>
+        <w:t>?”</w:t>
+      </w:r>
+    </w:p>
+    <w:p>
+      <w:pPr>
+        <w:spacing w:before="120" w:after="40" w:line="360" w:lineRule="auto"/>
+        <w:rPr>
+          <w:rFonts w:eastAsia="Calibri"/>
+          <w:b/>
+          <w:bCs/>
+        </w:rPr>
+      </w:pPr>
+      <w:r>
+        <w:rPr>
+          <w:rFonts w:eastAsia="Calibri"/>
+          <w:b/>
+          <w:bCs/>
+        </w:rPr>
+        <w:t>AI response summary:</w:t>
+      </w:r>
+    </w:p>
+    <w:p>
+      <w:pPr>
+        <w:spacing w:before="120" w:after="40" w:line="360" w:lineRule="auto"/>
+      </w:pPr>
+      <w:r>
+        <w:t>"</w:t>
+      </w:r>
+      <w:r>
+        <w:t xml:space="preserve"> </w:t>
+      </w:r>
+      <w:r>
+        <w:t xml:space="preserve">Your </w:t>
+      </w:r>
+      <w:proofErr w:type="spellStart"/>
+      <w:r>
+        <w:rPr>
+          <w:rStyle w:val="HTMLCode"/>
+          <w:rFonts w:ascii="Times New Roman" w:hAnsi="Times New Roman" w:cs="Times New Roman"/>
+        </w:rPr>
+        <w:t>checkObstacleCollisions</w:t>
+      </w:r>
+      <w:proofErr w:type="spellEnd"/>
+      <w:r>
+        <w:t xml:space="preserve"> calls </w:t>
+      </w:r>
+      <w:proofErr w:type="spellStart"/>
+      <w:proofErr w:type="gramStart"/>
+      <w:r>
+        <w:rPr>
+          <w:rStyle w:val="HTMLCode"/>
+          <w:rFonts w:ascii="Times New Roman" w:hAnsi="Times New Roman" w:cs="Times New Roman"/>
+        </w:rPr>
+        <w:t>obstacle.applyEffect</w:t>
+      </w:r>
+      <w:proofErr w:type="spellEnd"/>
+      <w:proofErr w:type="gramEnd"/>
+      <w:r>
+        <w:rPr>
+          <w:rStyle w:val="HTMLCode"/>
+          <w:rFonts w:ascii="Times New Roman" w:hAnsi="Times New Roman" w:cs="Times New Roman"/>
+        </w:rPr>
+        <w:t>(</w:t>
+      </w:r>
+      <w:proofErr w:type="spellStart"/>
+      <w:r>
+        <w:rPr>
+          <w:rStyle w:val="HTMLCode"/>
+          <w:rFonts w:ascii="Times New Roman" w:hAnsi="Times New Roman" w:cs="Times New Roman"/>
+        </w:rPr>
+        <w:t>playerVehicle</w:t>
+      </w:r>
+      <w:proofErr w:type="spellEnd"/>
+      <w:r>
+        <w:rPr>
+          <w:rStyle w:val="HTMLCode"/>
+          <w:rFonts w:ascii="Times New Roman" w:hAnsi="Times New Roman" w:cs="Times New Roman"/>
+        </w:rPr>
+        <w:t>)</w:t>
+      </w:r>
+      <w:r>
+        <w:t xml:space="preserve"> </w:t>
+      </w:r>
+      <w:r>
+        <w:rPr>
+          <w:rStyle w:val="Strong"/>
+          <w:b w:val="0"/>
+        </w:rPr>
+        <w:t>every single frame</w:t>
+      </w:r>
+      <w:r>
+        <w:t xml:space="preserve"> the vehicle is touching the pothole — not just once. Since hitting the pothole </w:t>
+      </w:r>
+      <w:r>
+        <w:rPr>
+          <w:rStyle w:val="Emphasis"/>
+        </w:rPr>
+        <w:t>also</w:t>
+      </w:r>
+      <w:r>
+        <w:t xml:space="preserve"> slashes your velocity to 30%, the vehicle often gets stuck slowly </w:t>
+      </w:r>
+      <w:r>
+        <w:t>crawling through/over it for many frames in a row."</w:t>
+      </w:r>
+    </w:p>
+    <w:p>
+      <w:pPr>
+        <w:spacing w:before="120" w:after="40" w:line="360" w:lineRule="auto"/>
+        <w:rPr>
+          <w:rFonts w:eastAsia="Calibri"/>
+          <w:b/>
+          <w:bCs/>
+        </w:rPr>
+      </w:pPr>
+      <w:r>
+        <w:rPr>
+          <w:rFonts w:eastAsia="Calibri"/>
+          <w:b/>
+          <w:bCs/>
+        </w:rPr>
+        <w:t>Problems identified:</w:t>
+      </w:r>
+    </w:p>
+    <w:p>
+      <w:pPr>
+        <w:spacing w:before="120" w:after="40" w:line="360" w:lineRule="auto"/>
+      </w:pPr>
+      <w:r>
+        <w:t>My</w:t>
+      </w:r>
+      <w:r>
+        <w:t xml:space="preserve"> </w:t>
+      </w:r>
+      <w:proofErr w:type="spellStart"/>
+      <w:r>
+        <w:rPr>
+          <w:rStyle w:val="HTMLCode"/>
+          <w:rFonts w:ascii="Times New Roman" w:hAnsi="Times New Roman" w:cs="Times New Roman"/>
+        </w:rPr>
+        <w:t>checkObstacleCollisions</w:t>
+      </w:r>
+      <w:proofErr w:type="spellEnd"/>
+      <w:r>
+        <w:t xml:space="preserve"> calls </w:t>
+      </w:r>
+      <w:proofErr w:type="spellStart"/>
+      <w:proofErr w:type="gramStart"/>
+      <w:r>
+        <w:rPr>
+          <w:rStyle w:val="HTMLCode"/>
+          <w:rFonts w:ascii="Times New Roman" w:hAnsi="Times New Roman" w:cs="Times New Roman"/>
+        </w:rPr>
+        <w:t>obstacle.applyEffect</w:t>
+      </w:r>
+      <w:proofErr w:type="spellEnd"/>
+      <w:proofErr w:type="gramEnd"/>
+      <w:r>
+        <w:rPr>
+          <w:rStyle w:val="HTMLCode"/>
+          <w:rFonts w:ascii="Times New Roman" w:hAnsi="Times New Roman" w:cs="Times New Roman"/>
+        </w:rPr>
+        <w:t>(</w:t>
+      </w:r>
+      <w:proofErr w:type="spellStart"/>
+      <w:r>
+        <w:rPr>
+          <w:rStyle w:val="HTMLCode"/>
+          <w:rFonts w:ascii="Times New Roman" w:hAnsi="Times New Roman" w:cs="Times New Roman"/>
+        </w:rPr>
+        <w:t>playerVehicle</w:t>
+      </w:r>
+      <w:proofErr w:type="spellEnd"/>
+      <w:r>
+        <w:rPr>
+          <w:rStyle w:val="HTMLCode"/>
+          <w:rFonts w:ascii="Times New Roman" w:hAnsi="Times New Roman" w:cs="Times New Roman"/>
+        </w:rPr>
+        <w:t>)</w:t>
+      </w:r>
+      <w:r>
+        <w:t xml:space="preserve"> </w:t>
+      </w:r>
+      <w:r>
+        <w:rPr>
+          <w:rStyle w:val="Strong"/>
+          <w:b w:val="0"/>
+        </w:rPr>
+        <w:t>every single frame</w:t>
+      </w:r>
+      <w:r>
+        <w:t xml:space="preserve"> the vehicle is touching the pothole</w:t>
+      </w:r>
+      <w:r>
+        <w:t>.</w:t>
+      </w:r>
+    </w:p>
+    <w:p>
+      <w:pPr>
+        <w:spacing w:before="120" w:after="40" w:line="360" w:lineRule="auto"/>
+        <w:rPr>
+          <w:rFonts w:eastAsia="Calibri"/>
+          <w:b/>
+          <w:bCs/>
+        </w:rPr>
+      </w:pPr>
+      <w:r>
+        <w:rPr>
+          <w:rFonts w:eastAsia="Calibri"/>
+          <w:b/>
+          <w:bCs/>
+        </w:rPr>
+        <w:t>How it was modified:</w:t>
+      </w:r>
+    </w:p>
+    <w:p>
+      <w:pPr>
+        <w:spacing w:before="120" w:after="40" w:line="360" w:lineRule="auto"/>
+      </w:pPr>
+      <w:r>
+        <w:rPr>
+          <w:rStyle w:val="Strong"/>
+          <w:b w:val="0"/>
+        </w:rPr>
+        <w:t>The fix:</w:t>
+      </w:r>
+      <w:r>
+        <w:t xml:space="preserve"> track contact state separately from the visual flash, so most obstacles apply their effect once per contact — while your </w:t>
+      </w:r>
+      <w:proofErr w:type="spellStart"/>
+      <w:r>
+        <w:rPr>
+          <w:rStyle w:val="HTMLCode"/>
+          <w:rFonts w:ascii="Times New Roman" w:hAnsi="Times New Roman" w:cs="Times New Roman"/>
+        </w:rPr>
+        <w:t>ConstructionZone</w:t>
+      </w:r>
+      <w:proofErr w:type="spellEnd"/>
+      <w:r>
+        <w:t xml:space="preserve"> (which is </w:t>
+      </w:r>
+      <w:r>
+        <w:rPr>
+          <w:rStyle w:val="Emphasis"/>
+        </w:rPr>
+        <w:t>supposed</w:t>
+      </w:r>
+      <w:r>
+        <w:t xml:space="preserve"> to drag continuously while you're inside it) still gets to reapply every frame.</w:t>
       </w:r>
     </w:p>
     <w:p>
@@ -893,8 +1204,6 @@
       <w:pPr>
         <w:pStyle w:val="NormalWeb"/>
       </w:pPr>
-      <w:bookmarkStart w:id="0" w:name="_GoBack"/>
-      <w:bookmarkEnd w:id="0"/>
     </w:p>
     <w:p>
       <w:pPr>
@@ -943,6 +1252,112 @@
                     <a:xfrm>
                       <a:off x="0" y="0"/>
                       <a:ext cx="6120130" cy="3065145"/>
+                    </a:xfrm>
+                    <a:prstGeom prst="rect">
+                      <a:avLst/>
+                    </a:prstGeom>
+                  </pic:spPr>
+                </pic:pic>
+              </a:graphicData>
+            </a:graphic>
+          </wp:inline>
+        </w:drawing>
+      </w:r>
+    </w:p>
+    <w:p>
+      <w:pPr>
+        <w:spacing w:after="160" w:line="360" w:lineRule="auto"/>
+        <w:jc w:val="both"/>
+      </w:pPr>
+    </w:p>
+    <w:p>
+      <w:pPr>
+        <w:spacing w:after="160" w:line="360" w:lineRule="auto"/>
+        <w:jc w:val="center"/>
+      </w:pPr>
+      <w:r>
+        <w:rPr>
+          <w:noProof/>
+        </w:rPr>
+        <w:drawing>
+          <wp:inline distT="0" distB="0" distL="0" distR="0">
+            <wp:extent cx="6120130" cy="2941955"/>
+            <wp:effectExtent l="0" t="0" r="0" b="0"/>
+            <wp:docPr id="8" name="Picture 8"/>
+            <wp:cNvGraphicFramePr>
+              <a:graphicFrameLocks xmlns:a="http://schemas.openxmlformats.org/drawingml/2006/main" noChangeAspect="1"/>
+            </wp:cNvGraphicFramePr>
+            <a:graphic xmlns:a="http://schemas.openxmlformats.org/drawingml/2006/main">
+              <a:graphicData uri="http://schemas.openxmlformats.org/drawingml/2006/picture">
+                <pic:pic xmlns:pic="http://schemas.openxmlformats.org/drawingml/2006/picture">
+                  <pic:nvPicPr>
+                    <pic:cNvPr id="8" name="Screenshot 2026-09-25 101045.png"/>
+                    <pic:cNvPicPr/>
+                  </pic:nvPicPr>
+                  <pic:blipFill>
+                    <a:blip r:embed="rId12">
+                      <a:extLst>
+                        <a:ext uri="{28A0092B-C50C-407E-A947-70E740481C1C}">
+                          <a14:useLocalDpi xmlns:a14="http://schemas.microsoft.com/office/drawing/2010/main" val="0"/>
+                        </a:ext>
+                      </a:extLst>
+                    </a:blip>
+                    <a:stretch>
+                      <a:fillRect/>
+                    </a:stretch>
+                  </pic:blipFill>
+                  <pic:spPr>
+                    <a:xfrm>
+                      <a:off x="0" y="0"/>
+                      <a:ext cx="6120130" cy="2941955"/>
+                    </a:xfrm>
+                    <a:prstGeom prst="rect">
+                      <a:avLst/>
+                    </a:prstGeom>
+                  </pic:spPr>
+                </pic:pic>
+              </a:graphicData>
+            </a:graphic>
+          </wp:inline>
+        </w:drawing>
+      </w:r>
+      <w:bookmarkStart w:id="0" w:name="_GoBack"/>
+      <w:bookmarkEnd w:id="0"/>
+      <w:r>
+        <w:rPr>
+          <w:noProof/>
+        </w:rPr>
+        <w:drawing>
+          <wp:inline distT="0" distB="0" distL="0" distR="0">
+            <wp:extent cx="5181600" cy="702672"/>
+            <wp:effectExtent l="0" t="0" r="0" b="2540"/>
+            <wp:docPr id="9" name="Picture 9"/>
+            <wp:cNvGraphicFramePr>
+              <a:graphicFrameLocks xmlns:a="http://schemas.openxmlformats.org/drawingml/2006/main" noChangeAspect="1"/>
+            </wp:cNvGraphicFramePr>
+            <a:graphic xmlns:a="http://schemas.openxmlformats.org/drawingml/2006/main">
+              <a:graphicData uri="http://schemas.openxmlformats.org/drawingml/2006/picture">
+                <pic:pic xmlns:pic="http://schemas.openxmlformats.org/drawingml/2006/picture">
+                  <pic:nvPicPr>
+                    <pic:cNvPr id="9" name="Screenshot 2026-09-25 101105.png"/>
+                    <pic:cNvPicPr/>
+                  </pic:nvPicPr>
+                  <pic:blipFill>
+                    <a:blip r:embed="rId13">
+                      <a:extLst>
+                        <a:ext uri="{28A0092B-C50C-407E-A947-70E740481C1C}">
+                          <a14:useLocalDpi xmlns:a14="http://schemas.microsoft.com/office/drawing/2010/main" val="0"/>
+                        </a:ext>
+                      </a:extLst>
+                    </a:blip>
+                    <a:stretch>
+                      <a:fillRect/>
+                    </a:stretch>
+                  </pic:blipFill>
+                  <pic:spPr>
+                    <a:xfrm>
+                      <a:off x="0" y="0"/>
+                      <a:ext cx="5268837" cy="714502"/>
                     </a:xfrm>
                     <a:prstGeom prst="rect">
                       <a:avLst/>
@@ -1656,6 +2071,28 @@
       <w:szCs w:val="24"/>
     </w:rPr>
   </w:style>
+  <w:style w:type="character" w:styleId="Strong">
+    <w:name w:val="Strong"/>
+    <w:basedOn w:val="DefaultParagraphFont"/>
+    <w:uiPriority w:val="22"/>
+    <w:qFormat/>
+    <w:rsid w:val="005F30ED"/>
+    <w:rPr>
+      <w:b/>
+      <w:bCs/>
+    </w:rPr>
+  </w:style>
+  <w:style w:type="character" w:styleId="Emphasis">
+    <w:name w:val="Emphasis"/>
+    <w:basedOn w:val="DefaultParagraphFont"/>
+    <w:uiPriority w:val="20"/>
+    <w:qFormat/>
+    <w:rsid w:val="005F30ED"/>
+    <w:rPr>
+      <w:i/>
+      <w:iCs/>
+    </w:rPr>
+  </w:style>
 </w:styles>
 </file>
 

</xml_diff>